<commit_message>
Fix SKPL: 10 gambar Food Rescue AI (Gambar 4.1-6.1) diganti diagram EcoMatch — swimlane 4 dirender PIL manual (mermaid tak bisa antar-lane), flowchart/use case/activity/sequence/DFD/konteks mermaid + wrapping 660 utk g42-g46, sequence label ALT dipersingkat, class & three-tier dilebarkan ke 6,3 inch, ERD pakai EcoMatch_06; extent wp:extent+a:ext dihitung ulang dari px (tinggi maks 8,85 inch, g42/g45 di-cap), caption ERD hapus frasa 'tanpa detail tipe data (level konseptual)' (ERD memuat tipe data), media image2-image11 byte-identik dgn sumber, grep 'food rescue' = 0 semua bagian XML, verifikasi Word COM 37 halaman + visual PDF 10 halaman figure + sync copy D:\SMT 3\ecomatch\dokumen identik SHA256
</commit_message>
<xml_diff>
--- a/docs/SKPL_EcoMatch_v2.0.docx
+++ b/docs/SKPL_EcoMatch_v2.0.docx
@@ -9632,7 +9632,7 @@
         <w:lastRenderedPageBreak/>
         <w:drawing>
           <wp:inline distT="0" distB="0" distL="0" distR="0" wp14:anchorId="3BB238C5" wp14:editId="3F38B1DC">
-            <wp:extent cx="5486400" cy="5972175"/>
+            <wp:extent cx="5486400" cy="4195482"/>
             <wp:effectExtent l="0" t="0" r="0" b="0"/>
             <wp:docPr id="653763409" name="Picture 653763409"/>
             <wp:cNvGraphicFramePr>
@@ -9657,7 +9657,7 @@
                   <pic:spPr bwMode="auto">
                     <a:xfrm>
                       <a:off x="0" y="0"/>
-                      <a:ext cx="5486400" cy="5972175"/>
+                      <a:ext cx="5486400" cy="4195482"/>
                     </a:xfrm>
                     <a:prstGeom prst="rect">
                       <a:avLst/>
@@ -9739,7 +9739,7 @@
         <w:lastRenderedPageBreak/>
         <w:drawing>
           <wp:inline distT="0" distB="0" distL="0" distR="0" wp14:anchorId="7D0C2C05" wp14:editId="5701B99F">
-            <wp:extent cx="3933825" cy="8210550"/>
+            <wp:extent cx="3398112" cy="8091841"/>
             <wp:effectExtent l="0" t="0" r="0" b="0"/>
             <wp:docPr id="1365297459" name="Picture 1365297459"/>
             <wp:cNvGraphicFramePr>
@@ -9764,7 +9764,7 @@
                   <pic:spPr bwMode="auto">
                     <a:xfrm>
                       <a:off x="0" y="0"/>
-                      <a:ext cx="3933825" cy="8210550"/>
+                      <a:ext cx="3398112" cy="8091841"/>
                     </a:xfrm>
                     <a:prstGeom prst="rect">
                       <a:avLst/>
@@ -9867,7 +9867,7 @@
         </w:rPr>
         <w:drawing>
           <wp:inline distT="0" distB="0" distL="0" distR="0" wp14:anchorId="783AE1B3" wp14:editId="05F1812C">
-            <wp:extent cx="5762625" cy="2705100"/>
+            <wp:extent cx="5762625" cy="3708766"/>
             <wp:effectExtent l="0" t="0" r="0" b="0"/>
             <wp:docPr id="109853691" name="Picture 109853691"/>
             <wp:cNvGraphicFramePr>
@@ -9892,7 +9892,7 @@
                   <pic:spPr bwMode="auto">
                     <a:xfrm>
                       <a:off x="0" y="0"/>
-                      <a:ext cx="5762625" cy="2705100"/>
+                      <a:ext cx="5762625" cy="3708766"/>
                     </a:xfrm>
                     <a:prstGeom prst="rect">
                       <a:avLst/>
@@ -9981,7 +9981,7 @@
         <w:lastRenderedPageBreak/>
         <w:drawing>
           <wp:inline distT="0" distB="0" distL="0" distR="0" wp14:anchorId="1CF53341" wp14:editId="05BBF5EC">
-            <wp:extent cx="3838575" cy="7867650"/>
+            <wp:extent cx="3838575" cy="3187388"/>
             <wp:effectExtent l="0" t="0" r="0" b="0"/>
             <wp:docPr id="1581525005" name="Picture 1581525005"/>
             <wp:cNvGraphicFramePr>
@@ -10006,7 +10006,7 @@
                   <pic:spPr bwMode="auto">
                     <a:xfrm>
                       <a:off x="0" y="0"/>
-                      <a:ext cx="3838575" cy="7867650"/>
+                      <a:ext cx="3838575" cy="3187388"/>
                     </a:xfrm>
                     <a:prstGeom prst="rect">
                       <a:avLst/>
@@ -10104,7 +10104,7 @@
         </w:rPr>
         <w:drawing>
           <wp:inline distT="0" distB="0" distL="0" distR="0" wp14:anchorId="16D5FFC8" wp14:editId="2AC2531B">
-            <wp:extent cx="5124450" cy="5391150"/>
+            <wp:extent cx="4345207" cy="8091840"/>
             <wp:effectExtent l="0" t="0" r="0" b="0"/>
             <wp:docPr id="1185988552" name="Picture 1185988552"/>
             <wp:cNvGraphicFramePr>
@@ -10129,7 +10129,7 @@
                   <pic:spPr bwMode="auto">
                     <a:xfrm>
                       <a:off x="0" y="0"/>
-                      <a:ext cx="5124450" cy="5391150"/>
+                      <a:ext cx="4345207" cy="8091840"/>
                     </a:xfrm>
                     <a:prstGeom prst="rect">
                       <a:avLst/>
@@ -10219,7 +10219,7 @@
         <w:lastRenderedPageBreak/>
         <w:drawing>
           <wp:inline distT="0" distB="0" distL="0" distR="0" wp14:anchorId="7BFAF62A" wp14:editId="65C2B4C6">
-            <wp:extent cx="3657600" cy="7820025"/>
+            <wp:extent cx="3657600" cy="6936651"/>
             <wp:effectExtent l="0" t="0" r="0" b="0"/>
             <wp:docPr id="1503279474" name="Picture 1503279474"/>
             <wp:cNvGraphicFramePr>
@@ -10244,7 +10244,7 @@
                   <pic:spPr bwMode="auto">
                     <a:xfrm>
                       <a:off x="0" y="0"/>
-                      <a:ext cx="3657600" cy="7820025"/>
+                      <a:ext cx="3657600" cy="6936651"/>
                     </a:xfrm>
                     <a:prstGeom prst="rect">
                       <a:avLst/>
@@ -10334,7 +10334,7 @@
         </w:rPr>
         <w:drawing>
           <wp:inline distT="0" distB="0" distL="0" distR="0" wp14:anchorId="799DF228" wp14:editId="3B5FEDC1">
-            <wp:extent cx="5762625" cy="4600575"/>
+            <wp:extent cx="5762625" cy="7717801"/>
             <wp:effectExtent l="0" t="0" r="0" b="0"/>
             <wp:docPr id="747247616" name="Picture 747247616"/>
             <wp:cNvGraphicFramePr>
@@ -10359,7 +10359,7 @@
                   <pic:spPr bwMode="auto">
                     <a:xfrm>
                       <a:off x="0" y="0"/>
-                      <a:ext cx="5762625" cy="4600575"/>
+                      <a:ext cx="5762625" cy="7717801"/>
                     </a:xfrm>
                     <a:prstGeom prst="rect">
                       <a:avLst/>
@@ -10431,7 +10431,7 @@
         <w:lastRenderedPageBreak/>
         <w:drawing>
           <wp:inline distT="0" distB="0" distL="0" distR="0" wp14:anchorId="6A30DD74" wp14:editId="6FAC8AE5">
-            <wp:extent cx="3562350" cy="6515100"/>
+            <wp:extent cx="5762625" cy="5498015"/>
             <wp:effectExtent l="0" t="0" r="0" b="0"/>
             <wp:docPr id="1935358706" name="Picture 1935358706"/>
             <wp:cNvGraphicFramePr>
@@ -10456,7 +10456,7 @@
                   <pic:spPr bwMode="auto">
                     <a:xfrm>
                       <a:off x="0" y="0"/>
-                      <a:ext cx="3562350" cy="6515100"/>
+                      <a:ext cx="5762625" cy="5498015"/>
                     </a:xfrm>
                     <a:prstGeom prst="rect">
                       <a:avLst/>
@@ -10561,7 +10561,7 @@
         </w:rPr>
         <w:drawing>
           <wp:inline distT="0" distB="0" distL="0" distR="0" wp14:anchorId="495978A3" wp14:editId="0875F264">
-            <wp:extent cx="5486400" cy="5553075"/>
+            <wp:extent cx="5762625" cy="5703823"/>
             <wp:effectExtent l="0" t="0" r="0" b="0"/>
             <wp:docPr id="345106971" name="Picture 345106971"/>
             <wp:cNvGraphicFramePr>
@@ -10586,7 +10586,7 @@
                   <pic:spPr bwMode="auto">
                     <a:xfrm>
                       <a:off x="0" y="0"/>
-                      <a:ext cx="5486400" cy="5553075"/>
+                      <a:ext cx="5762625" cy="5703823"/>
                     </a:xfrm>
                     <a:prstGeom prst="rect">
                       <a:avLst/>
@@ -12412,7 +12412,7 @@
           <w:szCs w:val="22"/>
         </w:rPr>
         <w:lastRenderedPageBreak/>
-        <w:t>ERD berikut menampilkan entitas, atribut utama, dan relasi antar entitas pada sistem EcoMatch tanpa detail tipe data (level konseptual).</w:t>
+        <w:t>ERD berikut menampilkan entitas, atribut utama, dan relasi antar entitas pada sistem EcoMatch.</w:t>
       </w:r>
     </w:p>
     <w:p>
@@ -12427,7 +12427,7 @@
         </w:rPr>
         <w:drawing>
           <wp:inline distT="0" distB="0" distL="0" distR="0" wp14:anchorId="2FE08C65" wp14:editId="5476BCA8">
-            <wp:extent cx="5762625" cy="3171825"/>
+            <wp:extent cx="5762625" cy="3579590"/>
             <wp:effectExtent l="0" t="0" r="0" b="0"/>
             <wp:docPr id="769510899" name="Picture 769510899"/>
             <wp:cNvGraphicFramePr>
@@ -12452,7 +12452,7 @@
                   <pic:spPr bwMode="auto">
                     <a:xfrm>
                       <a:off x="0" y="0"/>
-                      <a:ext cx="5762625" cy="3171825"/>
+                      <a:ext cx="5762625" cy="3579590"/>
                     </a:xfrm>
                     <a:prstGeom prst="rect">
                       <a:avLst/>

</xml_diff>